<commit_message>
Present research findings and related work; add isolated evidence checks
</commit_message>
<xml_diff>
--- a/reports/phase1/technical_report.docx
+++ b/reports/phase1/technical_report.docx
@@ -88,12 +88,17 @@
     </w:p>
     <w:p>
       <w:r>
+        <w:t>Rule-based mining-hazard prediction predates this study. Sikora and Wrobel [9] evaluated shift and hourly forecasts using longwall-specific monitoring data and also transferred rules between working faces. Their hazard definition and cohorts differ from the public UCI task, so their classification results provide engineering context rather than a numerical benchmark for our average precision.</w:t>
+      </w:r>
+    </w:p>
+    <w:p>
+      <w:r>
         <w:t>Validation protocols can change both the training history and the test population [3,4]. Comparing their scores on different shifts can therefore obscure the source of an apparent performance gap. A common test cohort makes that comparison interpretable, while probability assessment determines what the score scale conveys. Feature ablation, model explanations and frozen thresholds then connect the monitoring inputs to predictive contribution and warning workload.</w:t>
       </w:r>
     </w:p>
     <w:p>
       <w:r>
-        <w:t>This study examines how evaluation-cohort composition changes the validation gap and how monitoring information translates into forecasts and warning decisions. The common cohort supports comparisons across three model families, and nine prespecified feature combinations test the contribution of each engineering group. Exact TreeSHAP traces how the fitted XGBoost models use these signals across four test phases; comparison with refitted ablations separates model reliance from observed predictive gains. Four training reference budgets quantify detections, missed shifts and inspection workload after threshold transfer. All comparisons use saved row-level predictions and explicit training-only selection rules.</w:t>
+        <w:t>The contribution is an applied evaluation framework connecting comparable test records, probability assessment and engineering interpretation. Common test rows reveal how cohort composition changes the apparent protocol gap. Training-local correction and explicit probability references separate calibration improvement from baseline-relative skill. TreeSHAP and nine prespecified, refitted feature combinations distinguish the inputs used by a fitted model from their incremental predictive value. Frozen reference budgets then express the forecasts as detections, missed hazardous shifts and inspection workload. These empirical findings use established learning and explanation methods [6,7], saved row-level evidence and training-only selection.</w:t>
       </w:r>
     </w:p>
     <w:p>
@@ -8776,6 +8781,11 @@
     </w:p>
     <w:p>
       <w:r>
+        <w:t>Changing a probability scale and changing a decision rule address different engineering questions. Cost-sensitive decision theory [11] links probabilities to error costs; here historical reference scores supply empirical cutoffs. Prior-only distribution change [10] is a specific assumption rather than a diagnosis of the observed protocol gap. The companion decision study evaluates loss, capacity and refitting at frozen thresholds; it builds on this forecast evidence without treating calibration gains as evidence of operational warning value.</w:t>
+      </w:r>
+    </w:p>
+    <w:p>
+      <w:r>
         <w:t>These results concern the audited mirror under a record-order forecasting assumption. Timestamps, longwall identifiers and event locations are needed for direct temporal, site-specific and spatial validation. Repeated measurements can correspond to distinct shifts; the provenance audit establishes the mirror transformation rather than the operational validity of deduplication. Native TreeSHAP uses training leaf covers, and correlated inputs affect the allocation of contributions. Its signed values explain fitted associations rather than the causal effect of changing a monitoring variable. Phase stability is conditional on the fitted models and observed test distributions.</w:t>
       </w:r>
     </w:p>
@@ -8856,7 +8866,7 @@
         <w:rPr>
           <w:sz w:val="20"/>
         </w:rPr>
-        <w:t>[3] Bergmeir C, Benitez JM. On the use of cross-validation for time series predictor evaluation. Information Sciences, 2012, 191:192-213.</w:t>
+        <w:t>[3] Bergmeir C, Benitez JM. On the use of cross-validation for time series predictor evaluation. Information Sciences, 2012, 191:192-213. DOI: 10.1016/j.ins.2011.12.028.</w:t>
       </w:r>
     </w:p>
     <w:p>
@@ -8868,7 +8878,7 @@
         <w:rPr>
           <w:sz w:val="20"/>
         </w:rPr>
-        <w:t>[4] Roberts DR et al. Cross-validation strategies for data with temporal, spatial, hierarchical, or phylogenetic structure. Ecography, 2017, 40:913-929.</w:t>
+        <w:t>[4] Roberts DR et al. Cross-validation strategies for data with temporal, spatial, hierarchical, or phylogenetic structure. Ecography, 2017, 40:913-929. DOI: 10.1111/ecog.02881.</w:t>
       </w:r>
     </w:p>
     <w:p>
@@ -8917,6 +8927,42 @@
           <w:sz w:val="20"/>
         </w:rPr>
         <w:t>[8] XGBoost documentation. Booster.predict and exact feature contributions. https://xgboost.readthedocs.io/en/stable/python/python_api.html</w:t>
+      </w:r>
+    </w:p>
+    <w:p>
+      <w:pPr>
+        <w:ind w:left="317" w:hanging="317"/>
+        <w:jc w:val="left"/>
+      </w:pPr>
+      <w:r>
+        <w:rPr>
+          <w:sz w:val="20"/>
+        </w:rPr>
+        <w:t>[9] Sikora M, Wrobel L. Application of rule induction algorithms for analysis of data collected by seismic hazard monitoring systems in coal mines. Archives of Mining Sciences, 2010, 55(1):91-114. Author-linked full text: https://www.researchgate.net/publication/281395657</w:t>
+      </w:r>
+    </w:p>
+    <w:p>
+      <w:pPr>
+        <w:ind w:left="317" w:hanging="317"/>
+        <w:jc w:val="left"/>
+      </w:pPr>
+      <w:r>
+        <w:rPr>
+          <w:sz w:val="20"/>
+        </w:rPr>
+        <w:t>[10] Lipton ZC, Wang YX, Smola AJ. Detecting and Correcting for Label Shift with Black Box Predictors. Proceedings of ICML, PMLR 80, 2018:3122-3130. https://proceedings.mlr.press/v80/lipton18a.html</w:t>
+      </w:r>
+    </w:p>
+    <w:p>
+      <w:pPr>
+        <w:ind w:left="317" w:hanging="317"/>
+        <w:jc w:val="left"/>
+      </w:pPr>
+      <w:r>
+        <w:rPr>
+          <w:sz w:val="20"/>
+        </w:rPr>
+        <w:t>[11] Elkan C. The Foundations of Cost-Sensitive Learning. Proceedings of IJCAI, 2001:973-978. Author manuscript: https://cseweb.ucsd.edu/~elkan/rescale.pdf</w:t>
       </w:r>
     </w:p>
     <w:p>

</xml_diff>

<commit_message>
Refine manuscripts with academic writing and citation review
</commit_message>
<xml_diff>
--- a/reports/phase1/technical_report.docx
+++ b/reports/phase1/technical_report.docx
@@ -54,7 +54,7 @@
     </w:p>
     <w:p>
       <w:r>
-        <w:t>Test-cohort composition materially changes the apparent validation gap in seismic hazard forecasting. We evaluate logistic regression (LR), bagged CART and training-tuned XGBoost on 2,063 common test rows from the 2,578-row UCI Seismic Bumps mirror. Record order serves as a temporal proxy because timestamps and longwall identifiers are absent. Matching test rows reduces the apparent random-versus-record-order average-precision gap by 89.7 percent for LR and 86.9 percent for CART. Residual differences are 0.0114 (95 percent interval [-0.0110, 0.0243]) and 0.0188 ([0.0064, 0.0323]), respectively. These changes quantify sensitivity to evaluation-cohort composition. Training-prior correction improves LR expected calibration error from 0.2904 to 0.0271 and Brier score from 0.1462 to 0.0439. Corrected LR Brier skill is 0.0342 against the historical training-prior reference and -0.0751 against the retrospective test-prevalence reference. Nine prespecified feature combinations assess the predictive information in hazard ratings, geophone signals, seismic activity and shift type. Exact TreeSHAP identifies total seismic energy, low-energy event counts and pulse activity as recurring contributors to XGBoost predictions; comparison with refitted feature ablations distinguishes model reliance from incremental predictive value. At training reference budgets of 10 and 20 percent, supplementary holdout XGBoost produces 30 and 81 alerts and detects 3 and 6 of 26 hazardous shifts. The results distinguish three properties needed for engineering interpretation: performance on comparable shifts, the probability scale of the forecasts and the detection workload of a warning rule. Paired intervals describe uncertainty conditional on fixed predictions.</w:t>
+        <w:t>Test-cohort composition materially changes the apparent validation gap in seismic hazard forecasting. We compare logistic regression (LR), bagged CART and training-tuned XGBoost on 2,063 common test rows from the 2,578-row UCI Seismic Bumps mirror. Record order is a temporal proxy because timestamps and longwall identifiers are absent. Matching rows reduces the apparent random-versus-record-order average-precision gap by 89.7 percent for LR and 86.9 percent for CART. Residual differences are 0.0114 (95 percent interval [-0.0110, 0.0243]) and 0.0188 ([0.0064, 0.0323]); the comparison does not isolate leakage or drift. Training-prior correction improves LR expected calibration error from 0.2904 to 0.0271 and Brier score from 0.1462 to 0.0439. Corrected LR Brier skill is 0.0342 against the historical training-prior reference and -0.0751 against the retrospective test-prevalence reference. Nine prespecified feature combinations and exact TreeSHAP distinguish fitted-model feature use from incremental predictive value. Energy, low-energy event counts and pulse activity repeatedly contribute to XGBoost predictions. At 10 and 20 percent training reference budgets, supplementary holdout XGBoost produces 30 and 81 alerts, detecting 3 and 6 of 26 hazardous shifts. Together, matched cohorts, explicit probability references and detection counts connect forecast evaluation to inspection workload. Intervals condition on fixed predictions.</w:t>
       </w:r>
     </w:p>
     <w:p>
@@ -83,7 +83,7 @@
     </w:p>
     <w:p>
       <w:r>
-        <w:t>The UCI Seismic Bumps data provide a defined next-shift forecasting task: each record summarizes an eight-hour shift, and the target indicates whether the following shift contains a seismic event above 10,000 J [1]. Existing seismic and seismoacoustic hazard ratings appear alongside energy, pulse and event-count measurements. Their coexistence makes the additional predictive information in measured signals testable against the recorded assessments. The target is next-shift high-energy seismic occurrence; confirmed rockburst accidents are outside its label definition.</w:t>
+        <w:t>The UCI Seismic Bumps data provide a defined next-shift forecasting task: each record summarizes an eight-hour shift, and the target indicates whether the following shift contains a seismic event above 10,000 J [1]. Existing seismic and seismoacoustic hazard ratings appear alongside energy, pulse and event-count measurements. The data therefore support comparisons of recorded assessments with measured signals. The target is next-shift high-energy seismic occurrence; confirmed rockburst accidents are outside its label definition.</w:t>
       </w:r>
     </w:p>
     <w:p>
@@ -98,7 +98,7 @@
     </w:p>
     <w:p>
       <w:r>
-        <w:t>The contribution is an applied evaluation framework connecting comparable test records, probability assessment and engineering interpretation. Common test rows reveal how cohort composition changes the apparent protocol gap. Training-local correction and explicit probability references separate calibration improvement from baseline-relative skill. TreeSHAP and nine prespecified, refitted feature combinations distinguish the inputs used by a fitted model from their incremental predictive value. Frozen reference budgets then express the forecasts as detections, missed hazardous shifts and inspection workload. These empirical findings use established learning and explanation methods [6,7], saved row-level evidence and training-only selection.</w:t>
+        <w:t>This study connects three engineering questions: how cohort composition changes the validation comparison, whether probability correction improves assessment, and how monitoring signals contribute to predictions and warning workload. Common test rows reveal how cohort composition changes the apparent protocol gap. Training-local correction and explicit probability references separate calibration improvement from baseline-relative skill. TreeSHAP and nine prespecified, refitted feature combinations distinguish the inputs used by a fitted model from their incremental predictive value. Frozen reference budgets then express the forecasts as detections, missed hazardous shifts and inspection workload. These empirical findings use established learning and explanation methods [6,7], saved row-level evidence and training-only selection.</w:t>
       </w:r>
     </w:p>
     <w:p>
@@ -660,7 +660,7 @@
     </w:p>
     <w:p>
       <w:r>
-        <w:t>Full-feature XGBoost models explain their own outer-test predictions through native exact TreeSHAP, using the training-derived leaf covers as the tree-path-dependent reference [7,8]. Each row has 17 feature contributions and a bias term. Their sum reconstructs the raw log-odds margin; applying the logistic function reconstructs the predicted probability. Contributions are additive on the model's log-odds scale and describe fitted predictive associations.</w:t>
+        <w:t>XGBoost models with all features explain their own outer test predictions through native exact TreeSHAP. Training leaf covers provide its tree-path-dependent reference [7,8]. Each row has 17 feature contributions and a bias term. Their sum reconstructs the raw log-odds margin; applying the logistic function reconstructs the predicted probability. Contributions are additive on the model's log-odds scale and describe fitted predictive associations.</w:t>
       </w:r>
     </w:p>
     <w:p>
@@ -688,7 +688,7 @@
     </w:p>
     <w:p>
       <w:r>
-        <w:t>For LR, both threshold selection and alert classification use raw weighted-model scores. Prior-corrected probabilities are used separately for probability assessment. The inner and outer models are distinct fits, so refitting can alter raw-score distributions and the transferred alert rate even though the probability scales are not mixed. A frozen-inner-model comparison would isolate this refitting contribution from temporal distribution changes.</w:t>
+        <w:t>For LR, both threshold selection and alert classification use raw weighted-model scores. Prior-corrected probabilities are used separately for probability assessment. The inner and outer models are distinct fits, so refitting can alter raw-score distributions and the transferred alert rate even though the probability scales are not mixed. A fixed-inner-model comparison at the same cutoff would quantify the difference between these workflows on identical test rows; it would not identify a causal effect of refitting.</w:t>
       </w:r>
     </w:p>
     <w:p>
@@ -8768,7 +8768,7 @@
     </w:p>
     <w:p>
       <w:r>
-        <w:t>The SHAP-ablation comparison provides an engineering reading of the monitoring signals. Energy and low-energy event counts strongly influence the fitted XGBoost predictions, while refitting without their group yields a positive pooled AP difference whose interval includes zero. Their influence describes the fitted prediction mechanism; the ablation tests the performance of a different fitted model. Reading these results together prevents global importance from becoming a claim of incremental value. The warning-budget results extend this interpretation to decisions: additional detections come with additional false alerts, and a historical reference budget can produce a different alert rate on later records.</w:t>
+        <w:t>SHAP and ablation answer different engineering questions. Energy and low-energy event counts strongly influence the fitted XGBoost predictions, while refitting without their group yields a positive pooled AP difference whose interval includes zero. Their influence describes the fitted prediction mechanism; the ablation tests the performance of a different fitted model. Reading these results together prevents global importance from becoming a claim of incremental value. The warning-budget results extend this interpretation to decisions: additional detections come with additional false alerts, and a historical reference budget can produce a different alert rate on later records.</w:t>
       </w:r>
     </w:p>
     <w:p>
@@ -8786,7 +8786,7 @@
     </w:p>
     <w:p>
       <w:r>
-        <w:t>These results concern the audited mirror under a record-order forecasting assumption. Timestamps, longwall identifiers and event locations are needed for direct temporal, site-specific and spatial validation. Repeated measurements can correspond to distinct shifts; the provenance audit establishes the mirror transformation rather than the operational validity of deduplication. Native TreeSHAP uses training leaf covers, and correlated inputs affect the allocation of contributions. Its signed values explain fitted associations rather than the causal effect of changing a monitoring variable. Phase stability is conditional on the fitted models and observed test distributions.</w:t>
+        <w:t>These results concern the audited mirror under a record-order forecasting assumption. Timestamps, longwall identifiers and event locations are needed for direct temporal, site-specific and spatial validation. Repeated measurements can correspond to distinct shifts; the provenance audit establishes the mirror transformation rather than the operational validity of deduplication. Native TreeSHAP uses training leaf covers, and correlated inputs affect the allocation of contributions. Signed contributions explain how the fitted model uses a variable, not the causal effect of changing that variable. Phase stability is conditional on the fitted models and observed test distributions.</w:t>
       </w:r>
     </w:p>
     <w:p>
@@ -8804,7 +8804,7 @@
     </w:p>
     <w:p>
       <w:r>
-        <w:t>Recalculating performance on common test rows substantially reduces the apparent random-versus-record-order gap. The paired residual differences and their intervals measure the remaining protocol contrast; they do not identify a causal share of leakage or drift. Training-prior correction improves LR probability assessment, while its reference-dependent Brier skill shows why calibration gains need an explicit comparator. TreeSHAP and refitted ablations distinguish the signals used by a model from their observed incremental predictive value. Frozen-budget outcomes quantify the detections, missed shifts and false alerts associated with those forecasts. The engineering contribution is an auditable connection from monitoring signals to forecasts and inspection demand: matched shifts define the performance comparison, explicit probability references define calibration value, and detected, missed and falsely alerted shifts define warning workload.</w:t>
+        <w:t>This study evaluates seismic forecasts through matched test records, probability references and monitoring-feature comparisons. Matching rows reduces the apparent protocol gap without identifying a causal share of leakage or drift. Training-prior correction improves LR calibration, while baseline-relative Brier skill depends on the stated reference. TreeSHAP describes fitted-model feature use; refitted ablations assess incremental predictive value. Frozen-budget outcomes connect these forecasts to detected, missed and falsely alerted shifts. The resulting evidence supports engineering review of prediction and inspection demand under the stated retrospective design.</w:t>
       </w:r>
     </w:p>
     <w:p>
@@ -8817,12 +8817,17 @@
     </w:p>
     <w:p>
       <w:r>
-        <w:t>Source data are available from UCI [1] and the CSV mirror [2]. Saved evidence includes all feature-set predictions, inner-reference scores, fold audits, candidate-selection predictions and row-index manifests, bootstrap replicates, five random seeds, native XGBoost models, row-level TreeSHAP contributions and the predetermined case records. Result tables are generated from saved evidence. Source hashes and duplicate row mappings preserve the data version. Appendix Table A1 maps feature names to UCI definitions and the implemented engineering groups.</w:t>
+        <w:t>Source data are available from UCI [1] and the CSV mirror [2]. Saved evidence includes predictions for every feature set, scores from inner reference sets, fold audits, predictions for candidate selection and manifests of row indices. It also retains bootstrap replicates, five random seeds, native XGBoost models, TreeSHAP contributions for each row and the predetermined case records. Result tables are generated from saved evidence. Source hashes and duplicate row mappings preserve the data version. Appendix Table A1 maps feature names to UCI definitions and the implemented engineering groups.</w:t>
       </w:r>
     </w:p>
     <w:p>
       <w:r>
         <w:t>The extended analysis uses Python 3.12.14, NumPy 2.3.5, pandas 3.0.1, XGBoost 3.1.3 and SciPy 1.18.1. The legacy LR/CART baselines use the original verified Python 3.7 environment and retain their saved full-model predictions. Run commands from the repository root. Use the recorded baseline environment for python -m phase1.run_experiments and python -m phase1.run_engineering. For the extension, install requirements/requirements-research.txt in a separate Python 3.12 environment, then run python -m phase1.run_research, python -m phase1.review_analysis and python -m phase1.verify_research --replay. In a separate document environment, python -m phase1.generate_report --docx generates the paper; pwsh -NoProfile -ExecutionPolicy Bypass -File phase1/export_report.ps1 exports PDF. Use python -m phase1.verify_results --reports to check results and report agreement.</w:t>
+      </w:r>
+    </w:p>
+    <w:p>
+      <w:r>
+        <w:t>Reference metadata were cross-checked with the citation-management tools in Scientific Agent Skills [12].</w:t>
       </w:r>
     </w:p>
     <w:p>
@@ -8963,6 +8968,18 @@
           <w:sz w:val="20"/>
         </w:rPr>
         <w:t>[11] Elkan C. The Foundations of Cost-Sensitive Learning. Proceedings of IJCAI, 2001:973-978. Author manuscript: https://cseweb.ucsd.edu/~elkan/rescale.pdf</w:t>
+      </w:r>
+    </w:p>
+    <w:p>
+      <w:pPr>
+        <w:ind w:left="317" w:hanging="317"/>
+        <w:jc w:val="left"/>
+      </w:pPr>
+      <w:r>
+        <w:rPr>
+          <w:sz w:val="20"/>
+        </w:rPr>
+        <w:t>[12] Kassis T, Agarwal V, He Y, Patel D, Brueckner AM. Scientific Agent Skills: A Library of Procedural Knowledge for Research Agents. arXiv, 2026. DOI: 10.48550/arXiv.2609.00065. https://arxiv.org/abs/2609.00065</w:t>
       </w:r>
     </w:p>
     <w:p>

</xml_diff>

<commit_message>
Document author contributions and strengthen mining research context
</commit_message>
<xml_diff>
--- a/reports/phase1/technical_report.docx
+++ b/reports/phase1/technical_report.docx
@@ -89,6 +89,11 @@
     <w:p>
       <w:r>
         <w:t>Rule-based mining-hazard prediction predates this study. Sikora and Wrobel [9] evaluated shift and hourly forecasts using longwall-specific monitoring data and also transferred rules between working faces. Their hazard definition and cohorts differ from the public UCI task, so their classification results provide engineering context rather than a numerical benchmark for our average precision.</w:t>
+      </w:r>
+    </w:p>
+    <w:p>
+      <w:r>
+        <w:t>Janusz et al. [13] compared expert and sensor information and investigated cold start at new mining sites. Site adaptation requires identified locations and local histories; our common-row evaluation addresses protocol comparisons within an anonymous record sequence. The microseismic review by Anikiev et al. [14] distinguishes detection and location tasks from forecasting. This study uses shift summaries, not waveform detection or event-location models.</w:t>
       </w:r>
     </w:p>
     <w:p>
@@ -8791,7 +8796,7 @@
     </w:p>
     <w:p>
       <w:r>
-        <w:t>The feature comparisons are prespecified descriptive contrasts with unadjusted fixed-prediction intervals. A maximum AP among these feature sets is not treated as a validated model-selection result. The already inspected holdout supplies additional warning evidence but does not constitute an untouched confirmatory test. A subsequent study should preregister its feature and alert-policy choices, then test them on independent timestamped working-face data with defined inspection actions.</w:t>
+        <w:t>The feature comparisons are prespecified descriptive contrasts with unadjusted fixed-prediction intervals. A maximum AP among these feature sets is not treated as a validated model-selection result. The already inspected holdout supplies additional warning evidence but does not constitute an untouched confirmatory test. The cold-start question in [13] concerns adapting to a new site with limited local history. Our record blocks assess evaluation and cutoff transfer, without identifying site changes. A subsequent study should preregister its feature and alert-policy choices, then test them on independent timestamped working-face data with defined inspection actions.</w:t>
       </w:r>
     </w:p>
     <w:p>
@@ -8828,6 +8833,11 @@
     <w:p>
       <w:r>
         <w:t>Reference metadata were cross-checked with the citation-management tools in Scientific Agent Skills [12].</w:t>
+      </w:r>
+    </w:p>
+    <w:p>
+      <w:r>
+        <w:t>The author directed the research scope, protocol refinement and review priorities. ChatGPT and Codex substantially assisted implementation, execution, verification and writing. The repository CONTRIBUTIONS.md separates author review from recorded computational checks and links project decisions to evidence.</w:t>
       </w:r>
     </w:p>
     <w:p>
@@ -8980,6 +8990,30 @@
           <w:sz w:val="20"/>
         </w:rPr>
         <w:t>[12] Kassis T, Agarwal V, He Y, Patel D, Brueckner AM. Scientific Agent Skills: A Library of Procedural Knowledge for Research Agents. arXiv, 2026. DOI: 10.48550/arXiv.2609.00065. https://arxiv.org/abs/2609.00065</w:t>
+      </w:r>
+    </w:p>
+    <w:p>
+      <w:pPr>
+        <w:ind w:left="317" w:hanging="317"/>
+        <w:jc w:val="left"/>
+      </w:pPr>
+      <w:r>
+        <w:rPr>
+          <w:sz w:val="20"/>
+        </w:rPr>
+        <w:t>[13] Janusz A, Grzegorowski M, Michalak M, Wrobel L, Sikora M, Slezak D. Predicting seismic events in coal mines based on underground sensor measurements. Engineering Applications of Artificial Intelligence, 2017, 64:83-94. DOI: 10.1016/j.engappai.2017.06.002.</w:t>
+      </w:r>
+    </w:p>
+    <w:p>
+      <w:pPr>
+        <w:ind w:left="317" w:hanging="317"/>
+        <w:jc w:val="left"/>
+      </w:pPr>
+      <w:r>
+        <w:rPr>
+          <w:sz w:val="20"/>
+        </w:rPr>
+        <w:t>[14] Anikiev D, Birnie C, Waheed Ub, Alkhalifah T, Gu C, Verschuur DJ, Eisner L. Machine learning in microseismic monitoring. Earth-Science Reviews, 2023, 239:104371. DOI: 10.1016/j.earscirev.2023.104371.</w:t>
       </w:r>
     </w:p>
     <w:p>

</xml_diff>

<commit_message>
Fix bootstrap and source-audit boundaries and refresh verified papers
</commit_message>
<xml_diff>
--- a/reports/phase1/technical_report.docx
+++ b/reports/phase1/technical_report.docx
@@ -54,7 +54,7 @@
     </w:p>
     <w:p>
       <w:r>
-        <w:t>Test-cohort composition materially changes the apparent validation gap in seismic hazard forecasting. We compare logistic regression (LR), bagged CART and training-tuned XGBoost on 2,063 common test rows from the 2,578-row UCI Seismic Bumps mirror. Record order is a temporal proxy because timestamps and longwall identifiers are absent. Matching rows reduces the apparent random-versus-record-order average-precision gap by 89.7 percent for LR and 86.9 percent for CART. Residual differences are 0.0114 (95 percent interval [-0.0110, 0.0243]) and 0.0188 ([0.0064, 0.0323]); the comparison does not isolate leakage or drift. Training-prior correction improves LR expected calibration error from 0.2904 to 0.0271 and Brier score from 0.1462 to 0.0439. Corrected LR Brier skill is 0.0342 against the historical training-prior reference and -0.0751 against the retrospective test-prevalence reference. Nine prespecified feature combinations and exact TreeSHAP distinguish fitted-model feature use from incremental predictive value. Energy, low-energy event counts and pulse activity repeatedly contribute to XGBoost predictions. At 10 and 20 percent training reference budgets, supplementary holdout XGBoost produces 30 and 81 alerts, detecting 3 and 6 of 26 hazardous shifts. Together, matched cohorts, explicit probability references and detection counts connect forecast evaluation to inspection workload. Intervals condition on fixed predictions.</w:t>
+        <w:t>Test-cohort composition materially changes the apparent validation gap in seismic hazard forecasting. We compare logistic regression (LR), bagged CART and training-tuned XGBoost on 2,063 common test rows from the 2,578-row UCI Seismic Bumps mirror. Record order is a temporal proxy because timestamps and longwall identifiers are absent. Matching rows reduces the apparent random-versus-record-order average-precision gap by 89.7 percent for LR and 86.9 percent for CART. Residual differences are 0.0114 (95 percent interval [-0.0110, 0.0243]) and 0.0188 ([0.0064, 0.0323]); the comparison does not isolate leakage or drift. Training-prior correction improves LR expected calibration error from 0.2904 to 0.0271 and Brier score from 0.1462 to 0.0439. Corrected LR Brier skill is 0.0342 against the historical training-prior reference and -0.0751 against the retrospective test-prevalence reference. Nine prespecified feature combinations and exact TreeSHAP distinguish fitted-model feature use from incremental predictive value. Energy, low-energy event counts and pulse activity repeatedly contribute to XGBoost predictions. At 10 and 20 percent training reference budgets, supplementary holdout XGBoost produces 30 and 81 alerts, detecting 3 and 6 of 26 hazardous shifts. Matched cohorts, explicit probability references and detection counts provide a traceable basis for interpreting forecast performance and inspection demand. Intervals condition on fixed predictions.</w:t>
       </w:r>
     </w:p>
     <w:p>
@@ -619,7 +619,7 @@
     </w:p>
     <w:p>
       <w:r>
-        <w:t>LR retains L2 penalty 1.0, an unpenalized intercept and balanced class weights. Bagged CART retains 60 ordinary bootstrap trees, maximum depth 6, minimum leaf size 20, unweighted Gini and forest seed 7. XGBoost uses unweighted binary logistic loss and histogram trees, learning rate 0.05, minimum child weight 10 and L2 penalty 5.0, with full row and column sampling, seed 7 and two CPU threads [6]. Its fixed candidate grid combines depth 2 or 3 with 80 or 160 boosting rounds.</w:t>
+        <w:t>LR retains L2 penalty 1.0, an unpenalized intercept and balanced class weights. Bagged CART retains 60 ordinary bootstrap trees, maximum depth 6, minimum leaf size 20, unweighted Gini and forest seed 7. Every bootstrap draw is retained; single-class draws form constant leaf trees. Each feature supplies up to 12 split thresholds at quantiles 0.05 to 0.95. XGBoost uses unweighted binary logistic loss and histogram trees, learning rate 0.05, minimum child weight 10 and L2 penalty 5.0, with full row and column sampling, seed 7 and two CPU threads [6]. Its fixed candidate grid combines depth 2 or 3 with 80 or 160 boosting rounds.</w:t>
       </w:r>
     </w:p>
     <w:p>
@@ -8809,7 +8809,7 @@
     </w:p>
     <w:p>
       <w:r>
-        <w:t>This study evaluates seismic forecasts through matched test records, probability references and monitoring-feature comparisons. Matching rows reduces the apparent protocol gap without identifying a causal share of leakage or drift. Training-prior correction improves LR calibration, while baseline-relative Brier skill depends on the stated reference. TreeSHAP describes fitted-model feature use; refitted ablations assess incremental predictive value. Frozen-budget outcomes connect these forecasts to detected, missed and falsely alerted shifts. The resulting evidence supports engineering review of prediction and inspection demand under the stated retrospective design.</w:t>
+        <w:t>This study evaluates seismic forecasts through matched test records, probability references and monitoring-feature comparisons. Matching rows reduces the apparent protocol gap without identifying a causal share of leakage or drift. Training-prior correction improves LR calibration, while baseline-relative Brier skill depends on the stated reference. TreeSHAP describes fitted-model feature use; refitted ablations assess incremental predictive value. Frozen-budget outcomes connect these forecasts to detected, missed and falsely alerted shifts. The workflow links saved predictions to probability assessment, feature comparisons and inspection demand, making the scope of each engineering claim explicit.</w:t>
       </w:r>
     </w:p>
     <w:p>

</xml_diff>

<commit_message>
Add frozen-policy cost boundaries and prevalence precision
</commit_message>
<xml_diff>
--- a/reports/phase1/technical_report.docx
+++ b/reports/phase1/technical_report.docx
@@ -8787,6 +8787,11 @@
     <w:p>
       <w:r>
         <w:t>Changing a probability scale and changing a decision rule address different engineering questions. Cost-sensitive decision theory [11] links probabilities to error costs; here historical reference scores supply empirical cutoffs. Prior-only distribution change [10] is a specific assumption rather than a diagnosis of the observed protocol gap. The companion decision study evaluates loss, capacity and refitting at frozen thresholds; it builds on this forecast evidence without treating calibration gains as evidence of operational warning value.</w:t>
+      </w:r>
+    </w:p>
+    <w:p>
+      <w:r>
+        <w:t>Threshold-choice theory [15] places the scoring model, decision rule and operating conditions in the same loss framework. A reference budget selects a historical score cutoff; carrying that number forward does not enforce a future alert rate. Stage two makes fixed-model transfer its primary workflow and compares refitting separately. Its frozen-rule cost boundaries retain the historical selection cost while varying evaluation cost, and its prevalence scenarios retain class-conditional rates while varying class proportions. Precision changes under the latter assumption need not indicate changed ranking [16]. These decision calculations complement the present AP, probability-reference and feature-use evidence.</w:t>
       </w:r>
     </w:p>
     <w:p>
@@ -9014,6 +9019,30 @@
           <w:sz w:val="20"/>
         </w:rPr>
         <w:t>[14] Anikiev D, Birnie C, Waheed Ub, Alkhalifah T, Gu C, Verschuur DJ, Eisner L. Machine learning in microseismic monitoring. Earth-Science Reviews, 2023, 239:104371. DOI: 10.1016/j.earscirev.2023.104371.</w:t>
+      </w:r>
+    </w:p>
+    <w:p>
+      <w:pPr>
+        <w:ind w:left="317" w:hanging="317"/>
+        <w:jc w:val="left"/>
+      </w:pPr>
+      <w:r>
+        <w:rPr>
+          <w:sz w:val="20"/>
+        </w:rPr>
+        <w:t>[15] Hernández-Orallo J, Flach P, Ferri C. A Unified View of Performance Metrics: Translating Threshold Choice into Expected Classification Loss. Journal of Machine Learning Research, 2012, 13:2813-2869. https://jmlr.org/papers/v13/hernandez-orallo12a.html</w:t>
+      </w:r>
+    </w:p>
+    <w:p>
+      <w:pPr>
+        <w:ind w:left="317" w:hanging="317"/>
+        <w:jc w:val="left"/>
+      </w:pPr>
+      <w:r>
+        <w:rPr>
+          <w:sz w:val="20"/>
+        </w:rPr>
+        <w:t>[16] Saito T, Rehmsmeier M. The Precision-Recall Plot Is More Informative than the ROC Plot When Evaluating Binary Classifiers on Imbalanced Datasets. PLOS ONE, 2015, 10(3):e0118432. DOI: 10.1371/journal.pone.0118432.</w:t>
       </w:r>
     </w:p>
     <w:p>

</xml_diff>

<commit_message>
Move AI reference-checking disclosure out of paper bibliographies
</commit_message>
<xml_diff>
--- a/reports/phase1/technical_report.docx
+++ b/reports/phase1/technical_report.docx
@@ -93,7 +93,7 @@
     </w:p>
     <w:p>
       <w:r>
-        <w:t>Janusz et al. [13] compared expert and sensor information and investigated cold start at new mining sites. Site adaptation requires identified locations and local histories; our common-row evaluation addresses protocol comparisons within an anonymous record sequence. The microseismic review by Anikiev et al. [14] distinguishes detection and location tasks from forecasting. This study uses shift summaries, not waveform detection or event-location models.</w:t>
+        <w:t>Janusz et al. [12] compared expert and sensor information and investigated cold start at new mining sites. Site adaptation requires identified locations and local histories; our common-row evaluation addresses protocol comparisons within an anonymous record sequence. The microseismic review by Anikiev et al. [13] distinguishes detection and location tasks from forecasting. This study uses shift summaries, not waveform detection or event-location models.</w:t>
       </w:r>
     </w:p>
     <w:p>
@@ -8791,7 +8791,7 @@
     </w:p>
     <w:p>
       <w:r>
-        <w:t>Threshold-choice theory [15] places the scoring model, decision rule and operating conditions in the same loss framework. A reference budget selects a historical score cutoff; carrying that number forward does not enforce a future alert rate. Stage two makes fixed-model transfer its primary workflow and compares refitting separately. Its frozen-rule cost boundaries retain the historical selection cost while varying evaluation cost, and its prevalence scenarios retain class-conditional rates while varying class proportions. Precision changes under the latter assumption need not indicate changed ranking [16]. These decision calculations complement the present AP, probability-reference and feature-use evidence.</w:t>
+        <w:t>Threshold-choice theory [14] places the scoring model, decision rule and operating conditions in the same loss framework. A reference budget selects a historical score cutoff; carrying that number forward does not enforce a future alert rate. Stage two makes fixed-model transfer its primary workflow and compares refitting separately. Its frozen-rule cost boundaries retain the historical selection cost while varying evaluation cost, and its prevalence scenarios retain class-conditional rates while varying class proportions. Precision changes under the latter assumption need not indicate changed ranking [15]. These decision calculations complement the present AP, probability-reference and feature-use evidence.</w:t>
       </w:r>
     </w:p>
     <w:p>
@@ -8801,7 +8801,7 @@
     </w:p>
     <w:p>
       <w:r>
-        <w:t>The feature comparisons are prespecified descriptive contrasts with unadjusted fixed-prediction intervals. A maximum AP among these feature sets is not treated as a validated model-selection result. The already inspected holdout supplies additional warning evidence but does not constitute an untouched confirmatory test. The cold-start question in [13] concerns adapting to a new site with limited local history. Our record blocks assess evaluation and cutoff transfer, without identifying site changes. A subsequent study should preregister its feature and alert-policy choices, then test them on independent timestamped working-face data with defined inspection actions.</w:t>
+        <w:t>The feature comparisons are prespecified descriptive contrasts with unadjusted fixed-prediction intervals. A maximum AP among these feature sets is not treated as a validated model-selection result. The already inspected holdout supplies additional warning evidence but does not constitute an untouched confirmatory test. The cold-start question in [12] concerns adapting to a new site with limited local history. Our record blocks assess evaluation and cutoff transfer, without identifying site changes. A subsequent study should preregister its feature and alert-policy choices, then test them on independent timestamped working-face data with defined inspection actions.</w:t>
       </w:r>
     </w:p>
     <w:p>
@@ -8836,13 +8836,16 @@
       </w:r>
     </w:p>
     <w:p>
+      <w:pPr>
+        <w:pStyle w:val="Heading1"/>
+      </w:pPr>
       <w:r>
-        <w:t>Reference metadata were cross-checked with the citation-management tools in Scientific Agent Skills [12].</w:t>
+        <w:t>Acknowledgements and AI assistance</w:t>
       </w:r>
     </w:p>
     <w:p>
       <w:r>
-        <w:t>The author directed the research scope, protocol refinement and review priorities. ChatGPT and Codex substantially assisted implementation, execution, verification and writing. The repository CONTRIBUTIONS.md separates author review from recorded computational checks and links project decisions to evidence.</w:t>
+        <w:t>The author directed the research scope, protocol refinement and review priorities. ChatGPT and Codex substantially assisted implementation, execution, computational verification, reference-metadata checks and writing. The repository CONTRIBUTIONS.md separates author review from recorded computational checks and links project decisions to evidence.</w:t>
       </w:r>
     </w:p>
     <w:p>
@@ -8994,7 +8997,7 @@
         <w:rPr>
           <w:sz w:val="20"/>
         </w:rPr>
-        <w:t>[12] Kassis T, Agarwal V, He Y, Patel D, Brueckner AM. Scientific Agent Skills: A Library of Procedural Knowledge for Research Agents. arXiv, 2026. DOI: 10.48550/arXiv.2609.00065. https://arxiv.org/abs/2609.00065</w:t>
+        <w:t>[12] Janusz A, Grzegorowski M, Michalak M, Wrobel L, Sikora M, Slezak D. Predicting seismic events in coal mines based on underground sensor measurements. Engineering Applications of Artificial Intelligence, 2017, 64:83-94. DOI: 10.1016/j.engappai.2017.06.002.</w:t>
       </w:r>
     </w:p>
     <w:p>
@@ -9006,7 +9009,7 @@
         <w:rPr>
           <w:sz w:val="20"/>
         </w:rPr>
-        <w:t>[13] Janusz A, Grzegorowski M, Michalak M, Wrobel L, Sikora M, Slezak D. Predicting seismic events in coal mines based on underground sensor measurements. Engineering Applications of Artificial Intelligence, 2017, 64:83-94. DOI: 10.1016/j.engappai.2017.06.002.</w:t>
+        <w:t>[13] Anikiev D, Birnie C, Waheed Ub, Alkhalifah T, Gu C, Verschuur DJ, Eisner L. Machine learning in microseismic monitoring. Earth-Science Reviews, 2023, 239:104371. DOI: 10.1016/j.earscirev.2023.104371.</w:t>
       </w:r>
     </w:p>
     <w:p>
@@ -9018,7 +9021,7 @@
         <w:rPr>
           <w:sz w:val="20"/>
         </w:rPr>
-        <w:t>[14] Anikiev D, Birnie C, Waheed Ub, Alkhalifah T, Gu C, Verschuur DJ, Eisner L. Machine learning in microseismic monitoring. Earth-Science Reviews, 2023, 239:104371. DOI: 10.1016/j.earscirev.2023.104371.</w:t>
+        <w:t>[14] Hernández-Orallo J, Flach P, Ferri C. A Unified View of Performance Metrics: Translating Threshold Choice into Expected Classification Loss. Journal of Machine Learning Research, 2012, 13:2813-2869. https://jmlr.org/papers/v13/hernandez-orallo12a.html</w:t>
       </w:r>
     </w:p>
     <w:p>
@@ -9030,19 +9033,7 @@
         <w:rPr>
           <w:sz w:val="20"/>
         </w:rPr>
-        <w:t>[15] Hernández-Orallo J, Flach P, Ferri C. A Unified View of Performance Metrics: Translating Threshold Choice into Expected Classification Loss. Journal of Machine Learning Research, 2012, 13:2813-2869. https://jmlr.org/papers/v13/hernandez-orallo12a.html</w:t>
-      </w:r>
-    </w:p>
-    <w:p>
-      <w:pPr>
-        <w:ind w:left="317" w:hanging="317"/>
-        <w:jc w:val="left"/>
-      </w:pPr>
-      <w:r>
-        <w:rPr>
-          <w:sz w:val="20"/>
-        </w:rPr>
-        <w:t>[16] Saito T, Rehmsmeier M. The Precision-Recall Plot Is More Informative than the ROC Plot When Evaluating Binary Classifiers on Imbalanced Datasets. PLOS ONE, 2015, 10(3):e0118432. DOI: 10.1371/journal.pone.0118432.</w:t>
+        <w:t>[15] Saito T, Rehmsmeier M. The Precision-Recall Plot Is More Informative than the ROC Plot When Evaluating Binary Classifiers on Imbalanced Datasets. PLOS ONE, 2015, 10(3):e0118432. DOI: 10.1371/journal.pone.0118432.</w:t>
       </w:r>
     </w:p>
     <w:p>

</xml_diff>